<commit_message>
Mudança plano de arquitetura
</commit_message>
<xml_diff>
--- a/PastaUML/ExplicaçãoArquiteturaClasses.docx
+++ b/PastaUML/ExplicaçãoArquiteturaClasses.docx
@@ -18,7 +18,25 @@
           <w:sz w:val="32"/>
           <w:szCs w:val="32"/>
         </w:rPr>
-        <w:t>Neste projeto será empregada a arquitetura MVC para as Classes de Objetos do sistema.</w:t>
+        <w:t xml:space="preserve">Neste projeto será empregada a arquitetura </w:t>
+      </w:r>
+      <w:r>
+        <w:rPr>
+          <w:rFonts w:ascii="Comic Sans MS" w:hAnsi="Comic Sans MS"/>
+          <w:color w:val="7030A0"/>
+          <w:sz w:val="32"/>
+          <w:szCs w:val="32"/>
+        </w:rPr>
+        <w:t>Hexagonal</w:t>
+      </w:r>
+      <w:r>
+        <w:rPr>
+          <w:rFonts w:ascii="Comic Sans MS" w:hAnsi="Comic Sans MS"/>
+          <w:color w:val="7030A0"/>
+          <w:sz w:val="32"/>
+          <w:szCs w:val="32"/>
+        </w:rPr>
+        <w:t xml:space="preserve"> para as Classes de Objetos do sistema.</w:t>
       </w:r>
     </w:p>
     <w:sectPr>

</xml_diff>